<commit_message>
Resume: fix doubled 'digital' and CV typos (page + Word download)
'across digital, social, broadcast, and digital products' ->
'across social, broadcast, and digital media and products'. The Word
download also gets the two typo fixes and 'Logic Pro, Ableton'.

Co-Authored-By: Claude Opus 5.5 <noreply@anthropic.com>
</commit_message>
<xml_diff>
--- a/assets/files/jonny-aaronson-resume.docx
+++ b/assets/files/jonny-aaronson-resume.docx
@@ -283,7 +283,7 @@
           <w:rtl w:val="0"/>
           <w:lang w:val="en-US"/>
         </w:rPr>
-        <w:t>Senior Motion Designer and Video Editor specializing in scalable motion systems, brand storytelling, and UX-aligned animation across digital, social, broadcast, and digital products. Extensive experience partnering with Brand, Marketing, and Product teams to deliver performance-aware creative, from concept through final delivery. Expert in After Effects, Premiere, and animation workflows built for speed, consistency, and scale.</w:t>
+        <w:t>Senior Motion Designer and Video Editor specializing in scalable motion systems, brand storytelling, and UX-aligned animation across social, broadcast, and digital media and products. Extensive experience partnering with Brand, Marketing, and Product teams to deliver performance-aware creative, from concept through final delivery. Expert in After Effects, Premiere, and animation workflows built for speed, consistency, and scale.</w:t>
       </w:r>
     </w:p>
     <w:p>
@@ -373,7 +373,7 @@
           <w:rtl w:val="0"/>
           <w:lang w:val="en-US"/>
         </w:rPr>
-        <w:t>After Effects, Premiere Pro, Illustrator, Photoshop, Cinema 4D, Blender, Figma, DaVinci Resolve, Mocha, Nuke, AI-assisted creative tools, Procreate, Audition, Logic Pro. Ableton Live, JSON / LottieFiles, Xd, Rive, HTML/CSS, MS Office, Google Suite, CapCut</w:t>
+        <w:t>After Effects, Premiere Pro, Illustrator, Photoshop, Cinema 4D, Blender, Figma, DaVinci Resolve, Mocha, Nuke, AI-assisted creative tools, Procreate, Audition, Logic Pro, Ableton Live, JSON / LottieFiles, Xd, Rive, HTML/CSS, MS Office, Google Suite, CapCut</w:t>
       </w:r>
     </w:p>
     <w:p>
@@ -606,7 +606,7 @@
           <w:rtl w:val="0"/>
           <w:lang w:val="en-US"/>
         </w:rPr>
-        <w:t>Lead end-to-end creative strategy through, motion design, video editing, VFX/compositing, audio design, UX motion, and storyboarding for clients across film/TV, education, healthcare, gaming, manufacturing, hospitality, and web services</w:t>
+        <w:t>Lead end-to-end creative strategy through motion design, video editing, VFX/compositing, audio design, UX motion, and storyboarding for clients across film/TV, education, healthcare, gaming, manufacturing, hospitality, and web services</w:t>
       </w:r>
     </w:p>
     <w:p>
@@ -662,7 +662,7 @@
           <w:rtl w:val="0"/>
           <w:lang w:val="en-US"/>
         </w:rPr>
-        <w:t>Translate complex concepts into clear, engaging visual narratives across digital, social, broadcast, and experiential platform</w:t>
+        <w:t>Translate complex concepts into clear, engaging visual narratives across digital, social, broadcast, and experiential platforms</w:t>
       </w:r>
     </w:p>
     <w:p>

</xml_diff>

<commit_message>
Resume: switch to CV 26 MD2 (page, PDF and Word all match)
New summary, adds Captioning & Accessibility, 'Best Visual Effects' for
the Legend 3D nomination; Word tagline aligned with the PDF.

Co-Authored-By: Claude Opus 5.5 <noreply@anthropic.com>
</commit_message>
<xml_diff>
--- a/assets/files/jonny-aaronson-resume.docx
+++ b/assets/files/jonny-aaronson-resume.docx
@@ -78,7 +78,7 @@
           <w:rtl w:val="0"/>
           <w:lang w:val="en-US"/>
         </w:rPr>
-        <w:t>Motion Systems | Brand Storytelling | UX-Aligned Animation</w:t>
+        <w:t>Motion Systems | Animation | Storytelling</w:t>
       </w:r>
     </w:p>
     <w:p>
@@ -283,7 +283,7 @@
           <w:rtl w:val="0"/>
           <w:lang w:val="en-US"/>
         </w:rPr>
-        <w:t>Senior Motion Designer and Video Editor specializing in scalable motion systems, brand storytelling, and UX-aligned animation across social, broadcast, and digital media and products. Extensive experience partnering with Brand, Marketing, and Product teams to deliver performance-aware creative, from concept through final delivery. Expert in After Effects, Premiere, and animation workflows built for speed, consistency, and scale.</w:t>
+        <w:t>Senior Motion Designer and Video Editor specializing in motion systems, animation, and clear visual storytelling across digital, educational, and broadcast media. Experienced turning complex subjects into engaging video for learners and broad audiences, including online course content for Harvard Business School and instructional video at Navient. Expert in After Effects, Premiere, and template-driven workflows built for consistency and scale.</w:t>
       </w:r>
     </w:p>
     <w:p>
@@ -440,7 +440,7 @@
           <w:rtl w:val="0"/>
           <w:lang w:val="en-US"/>
         </w:rPr>
-        <w:t>Creative Systems &amp; Standards, Cross-functional Collaboration, Performance-aware Creative (testing &amp; iteration), UI / UX &amp; Prototyping, User Research, Color Grading, Information Architecture, Lighting &amp; Cinematography, 3D Modeling</w:t>
+        <w:t>Creative Systems &amp; Standards, Captioning &amp; Accessibility, Cross-functional Collaboration, Performance-aware Creative (testing &amp; iteration), UI / UX &amp; Prototyping, User Research, Color Grading, Information Architecture, Lighting &amp; Cinematography, 3D Modeling</w:t>
       </w:r>
     </w:p>
     <w:p>
@@ -1676,7 +1676,7 @@
           <w:rtl w:val="0"/>
           <w:lang w:val="en-US"/>
         </w:rPr>
-        <w:t xml:space="preserve">Composited and corrected 2D footage for use in 3D space, including rotoscoping and clean plate generation for Transformers: Dark of the Moon, nominated for Academy Award for Best Special Effects, supporting a film project generating approximately $10M in contract </w:t>
+        <w:t xml:space="preserve">Composited and corrected 2D footage for use in 3D space, including rotoscoping and clean plate generation for Transformers: Dark of the Moon, nominated for Academy Award for Best Visual Effects, supporting a film project generating approximately $10M in contract </w:t>
       </w:r>
       <w:r>
         <w:rPr>

</xml_diff>

<commit_message>
Resume: use the exported MD2 Word file for the DOCX download
Co-Authored-By: Claude Opus 5.5 <noreply@anthropic.com>
</commit_message>
<xml_diff>
--- a/assets/files/jonny-aaronson-resume.docx
+++ b/assets/files/jonny-aaronson-resume.docx
@@ -78,7 +78,35 @@
           <w:rtl w:val="0"/>
           <w:lang w:val="en-US"/>
         </w:rPr>
-        <w:t>Motion Systems | Animation | Storytelling</w:t>
+        <w:t>Motion Systems |</w:t>
+      </w:r>
+      <w:r>
+        <w:rPr>
+          <w:rtl w:val="0"/>
+          <w:lang w:val="en-US"/>
+        </w:rPr>
+        <w:t xml:space="preserve"> </w:t>
+      </w:r>
+      <w:r>
+        <w:rPr>
+          <w:rtl w:val="0"/>
+          <w:lang w:val="en-US"/>
+        </w:rPr>
+        <w:t>Animation</w:t>
+      </w:r>
+      <w:r>
+        <w:rPr>
+          <w:rtl w:val="0"/>
+          <w:lang w:val="en-US"/>
+        </w:rPr>
+        <w:t xml:space="preserve"> </w:t>
+      </w:r>
+      <w:r>
+        <w:rPr>
+          <w:rtl w:val="0"/>
+          <w:lang w:val="en-US"/>
+        </w:rPr>
+        <w:t>| Storytelling</w:t>
       </w:r>
     </w:p>
     <w:p>
@@ -126,8 +154,6 @@
           </w14:textFill>
         </w:rPr>
         <w:fldChar w:fldCharType="begin" w:fldLock="0"/>
-        <w:instrText xml:space="preserve"> HYPERLINK "https://www.aaronsonmotion.com/"</w:instrText>
-        <w:fldChar w:fldCharType="separate" w:fldLock="0"/>
       </w:r>
       <w:r>
         <w:rPr>
@@ -137,7 +163,6 @@
           <w:sz w:val="20"/>
           <w:szCs w:val="20"/>
           <w:u w:val="single" w:color="0563c1"/>
-          <w:rtl w:val="0"/>
           <w:lang w:val="nl-NL"/>
           <w14:textFill>
             <w14:solidFill>
@@ -145,39 +170,106 @@
             </w14:solidFill>
           </w14:textFill>
         </w:rPr>
-        <w:t>aaronsonmotion.com</w:t>
-      </w:r>
-      <w:r>
-        <w:rPr/>
-        <w:fldChar w:fldCharType="end" w:fldLock="0"/>
-      </w:r>
-      <w:r>
-        <w:rPr>
-          <w:rStyle w:val="None"/>
-          <w:sz w:val="20"/>
-          <w:szCs w:val="20"/>
-          <w:rtl w:val="0"/>
-          <w:lang w:val="en-US"/>
-        </w:rPr>
-        <w:t xml:space="preserve"> || </w:t>
-      </w:r>
-      <w:r>
-        <w:rPr>
-          <w:rStyle w:val="Hyperlink.1"/>
+        <w:instrText xml:space="preserve"> HYPERLINK "https://www.aaronsonmotion.com/"</w:instrText>
+      </w:r>
+      <w:r>
+        <w:rPr>
+          <w:rStyle w:val="Hyperlink.0"/>
           <w:outline w:val="0"/>
           <w:color w:val="0563c1"/>
           <w:sz w:val="20"/>
           <w:szCs w:val="20"/>
           <w:u w:val="single" w:color="0563c1"/>
-          <w:lang w:val="en-US"/>
+          <w:lang w:val="nl-NL"/>
           <w14:textFill>
             <w14:solidFill>
               <w14:srgbClr w14:val="0563C1"/>
             </w14:solidFill>
           </w14:textFill>
         </w:rPr>
+        <w:fldChar w:fldCharType="separate" w:fldLock="0"/>
+      </w:r>
+      <w:r>
+        <w:rPr>
+          <w:rStyle w:val="Hyperlink.0"/>
+          <w:outline w:val="0"/>
+          <w:color w:val="0563c1"/>
+          <w:sz w:val="20"/>
+          <w:szCs w:val="20"/>
+          <w:u w:val="single" w:color="0563c1"/>
+          <w:rtl w:val="0"/>
+          <w:lang w:val="nl-NL"/>
+          <w14:textFill>
+            <w14:solidFill>
+              <w14:srgbClr w14:val="0563C1"/>
+            </w14:solidFill>
+          </w14:textFill>
+        </w:rPr>
+        <w:t>aaronsonmotion.com</w:t>
+      </w:r>
+      <w:r>
+        <w:rPr/>
+        <w:fldChar w:fldCharType="end" w:fldLock="0"/>
+      </w:r>
+      <w:r>
+        <w:rPr>
+          <w:rStyle w:val="None"/>
+          <w:sz w:val="20"/>
+          <w:szCs w:val="20"/>
+          <w:rtl w:val="0"/>
+          <w:lang w:val="en-US"/>
+        </w:rPr>
+        <w:t xml:space="preserve"> || </w:t>
+      </w:r>
+      <w:r>
+        <w:rPr>
+          <w:rStyle w:val="Hyperlink.1"/>
+          <w:outline w:val="0"/>
+          <w:color w:val="0563c1"/>
+          <w:sz w:val="20"/>
+          <w:szCs w:val="20"/>
+          <w:u w:val="single" w:color="0563c1"/>
+          <w:lang w:val="en-US"/>
+          <w14:textFill>
+            <w14:solidFill>
+              <w14:srgbClr w14:val="0563C1"/>
+            </w14:solidFill>
+          </w14:textFill>
+        </w:rPr>
         <w:fldChar w:fldCharType="begin" w:fldLock="0"/>
+      </w:r>
+      <w:r>
+        <w:rPr>
+          <w:rStyle w:val="Hyperlink.1"/>
+          <w:outline w:val="0"/>
+          <w:color w:val="0563c1"/>
+          <w:sz w:val="20"/>
+          <w:szCs w:val="20"/>
+          <w:u w:val="single" w:color="0563c1"/>
+          <w:lang w:val="en-US"/>
+          <w14:textFill>
+            <w14:solidFill>
+              <w14:srgbClr w14:val="0563C1"/>
+            </w14:solidFill>
+          </w14:textFill>
+        </w:rPr>
         <w:instrText xml:space="preserve"> HYPERLINK "https://www.linkedin.com/in/jonnyaaronson/"</w:instrText>
+      </w:r>
+      <w:r>
+        <w:rPr>
+          <w:rStyle w:val="Hyperlink.1"/>
+          <w:outline w:val="0"/>
+          <w:color w:val="0563c1"/>
+          <w:sz w:val="20"/>
+          <w:szCs w:val="20"/>
+          <w:u w:val="single" w:color="0563c1"/>
+          <w:lang w:val="en-US"/>
+          <w14:textFill>
+            <w14:solidFill>
+              <w14:srgbClr w14:val="0563C1"/>
+            </w14:solidFill>
+          </w14:textFill>
+        </w:rPr>
         <w:fldChar w:fldCharType="separate" w:fldLock="0"/>
       </w:r>
       <w:r>
@@ -373,7 +465,27 @@
           <w:rtl w:val="0"/>
           <w:lang w:val="en-US"/>
         </w:rPr>
-        <w:t>After Effects, Premiere Pro, Illustrator, Photoshop, Cinema 4D, Blender, Figma, DaVinci Resolve, Mocha, Nuke, AI-assisted creative tools, Procreate, Audition, Logic Pro, Ableton Live, JSON / LottieFiles, Xd, Rive, HTML/CSS, MS Office, Google Suite, CapCut</w:t>
+        <w:t>After Effects, Premiere Pro, Illustrator, Photoshop, Cinema 4D, Blender, Figma, DaVinci Resolve, Mocha, Nuke, AI-assisted creative tools, Procreate, Audition, Logic Pro</w:t>
+      </w:r>
+      <w:r>
+        <w:rPr>
+          <w:rStyle w:val="None"/>
+          <w:sz w:val="20"/>
+          <w:szCs w:val="20"/>
+          <w:rtl w:val="0"/>
+          <w:lang w:val="en-US"/>
+        </w:rPr>
+        <w:t>,</w:t>
+      </w:r>
+      <w:r>
+        <w:rPr>
+          <w:rStyle w:val="None"/>
+          <w:sz w:val="20"/>
+          <w:szCs w:val="20"/>
+          <w:rtl w:val="0"/>
+          <w:lang w:val="en-US"/>
+        </w:rPr>
+        <w:t xml:space="preserve"> Ableton Live, JSON / LottieFiles, Xd, Rive, HTML/CSS, MS Office, Google Suite, CapCut</w:t>
       </w:r>
     </w:p>
     <w:p>
@@ -440,7 +552,27 @@
           <w:rtl w:val="0"/>
           <w:lang w:val="en-US"/>
         </w:rPr>
-        <w:t>Creative Systems &amp; Standards, Captioning &amp; Accessibility, Cross-functional Collaboration, Performance-aware Creative (testing &amp; iteration), UI / UX &amp; Prototyping, User Research, Color Grading, Information Architecture, Lighting &amp; Cinematography, 3D Modeling</w:t>
+        <w:t>Creative Systems &amp; Standards, Captioning &amp; Accessibility</w:t>
+      </w:r>
+      <w:r>
+        <w:rPr>
+          <w:rStyle w:val="None"/>
+          <w:sz w:val="20"/>
+          <w:szCs w:val="20"/>
+          <w:rtl w:val="0"/>
+          <w:lang w:val="en-US"/>
+        </w:rPr>
+        <w:t xml:space="preserve">, </w:t>
+      </w:r>
+      <w:r>
+        <w:rPr>
+          <w:rStyle w:val="None"/>
+          <w:sz w:val="20"/>
+          <w:szCs w:val="20"/>
+          <w:rtl w:val="0"/>
+          <w:lang w:val="en-US"/>
+        </w:rPr>
+        <w:t>Cross-functional Collaboration, Performance-aware Creative (testing &amp; iteration), UI / UX &amp; Prototyping, User Research, Color Grading, Information Architecture, Lighting &amp; Cinematography, 3D Modeling</w:t>
       </w:r>
     </w:p>
     <w:p>
@@ -570,7 +702,17 @@
           <w:rtl w:val="0"/>
           <w:lang w:val="en-US"/>
         </w:rPr>
-        <w:t>–Present</w:t>
+        <w:t>–</w:t>
+      </w:r>
+      <w:r>
+        <w:rPr>
+          <w:rStyle w:val="None"/>
+          <w:sz w:val="20"/>
+          <w:szCs w:val="20"/>
+          <w:rtl w:val="0"/>
+          <w:lang w:val="en-US"/>
+        </w:rPr>
+        <w:t>Present</w:t>
       </w:r>
       <w:r>
         <w:rPr>
@@ -662,7 +804,17 @@
           <w:rtl w:val="0"/>
           <w:lang w:val="en-US"/>
         </w:rPr>
-        <w:t>Translate complex concepts into clear, engaging visual narratives across digital, social, broadcast, and experiential platforms</w:t>
+        <w:t>Translate complex concepts into clear, engaging visual narratives across digital, social, broadcast, and experiential platform</w:t>
+      </w:r>
+      <w:r>
+        <w:rPr>
+          <w:rStyle w:val="None"/>
+          <w:sz w:val="20"/>
+          <w:szCs w:val="20"/>
+          <w:rtl w:val="0"/>
+          <w:lang w:val="en-US"/>
+        </w:rPr>
+        <w:t>s</w:t>
       </w:r>
     </w:p>
     <w:p>
@@ -767,7 +919,27 @@
         </w:rPr>
         <w:t xml:space="preserve"> </w:t>
         <w:tab/>
-        <w:t>2023–2025</w:t>
+        <w:t>2023</w:t>
+      </w:r>
+      <w:r>
+        <w:rPr>
+          <w:rStyle w:val="None"/>
+          <w:sz w:val="20"/>
+          <w:szCs w:val="20"/>
+          <w:rtl w:val="0"/>
+          <w:lang w:val="en-US"/>
+        </w:rPr>
+        <w:t>–</w:t>
+      </w:r>
+      <w:r>
+        <w:rPr>
+          <w:rStyle w:val="None"/>
+          <w:sz w:val="20"/>
+          <w:szCs w:val="20"/>
+          <w:rtl w:val="0"/>
+          <w:lang w:val="en-US"/>
+        </w:rPr>
+        <w:t>2025</w:t>
       </w:r>
     </w:p>
     <w:p>
@@ -1000,7 +1172,27 @@
         </w:rPr>
         <w:t xml:space="preserve"> </w:t>
         <w:tab/>
-        <w:t>2017–2023</w:t>
+        <w:t>2017</w:t>
+      </w:r>
+      <w:r>
+        <w:rPr>
+          <w:rStyle w:val="None"/>
+          <w:sz w:val="20"/>
+          <w:szCs w:val="20"/>
+          <w:rtl w:val="0"/>
+          <w:lang w:val="en-US"/>
+        </w:rPr>
+        <w:t>–</w:t>
+      </w:r>
+      <w:r>
+        <w:rPr>
+          <w:rStyle w:val="None"/>
+          <w:sz w:val="20"/>
+          <w:szCs w:val="20"/>
+          <w:rtl w:val="0"/>
+          <w:lang w:val="en-US"/>
+        </w:rPr>
+        <w:t>2023</w:t>
       </w:r>
     </w:p>
     <w:p>
@@ -1163,7 +1355,27 @@
         </w:rPr>
         <w:t xml:space="preserve"> </w:t>
         <w:tab/>
-        <w:t>2014–2018</w:t>
+        <w:t>2014</w:t>
+      </w:r>
+      <w:r>
+        <w:rPr>
+          <w:rStyle w:val="None"/>
+          <w:sz w:val="20"/>
+          <w:szCs w:val="20"/>
+          <w:rtl w:val="0"/>
+          <w:lang w:val="en-US"/>
+        </w:rPr>
+        <w:t>–</w:t>
+      </w:r>
+      <w:r>
+        <w:rPr>
+          <w:rStyle w:val="None"/>
+          <w:sz w:val="20"/>
+          <w:szCs w:val="20"/>
+          <w:rtl w:val="0"/>
+          <w:lang w:val="en-US"/>
+        </w:rPr>
+        <w:t>2018</w:t>
       </w:r>
     </w:p>
     <w:p>
@@ -1261,7 +1473,27 @@
           <w:rtl w:val="0"/>
           <w:lang w:val="en-US"/>
         </w:rPr>
-        <w:t>Developed motion content for a multi-panel Christie MicroTiles display (3840×1200) in the Visitor Center Presentation Room</w:t>
+        <w:t>Developed motion content for a multi-panel Christie MicroTiles display (3840</w:t>
+      </w:r>
+      <w:r>
+        <w:rPr>
+          <w:rStyle w:val="None"/>
+          <w:sz w:val="20"/>
+          <w:szCs w:val="20"/>
+          <w:rtl w:val="0"/>
+          <w:lang w:val="en-US"/>
+        </w:rPr>
+        <w:t>×</w:t>
+      </w:r>
+      <w:r>
+        <w:rPr>
+          <w:rStyle w:val="None"/>
+          <w:sz w:val="20"/>
+          <w:szCs w:val="20"/>
+          <w:rtl w:val="0"/>
+          <w:lang w:val="en-US"/>
+        </w:rPr>
+        <w:t>1200) in the Visitor Center Presentation Room</w:t>
       </w:r>
     </w:p>
     <w:p>
@@ -1337,7 +1569,19 @@
           <w:rtl w:val="0"/>
           <w:lang w:val="en-US"/>
         </w:rPr>
-        <w:t>ADDITIONAL EXPERIENCE</w:t>
+        <w:t>A</w:t>
+      </w:r>
+      <w:r>
+        <w:rPr>
+          <w:rStyle w:val="None"/>
+          <w:b w:val="1"/>
+          <w:bCs w:val="1"/>
+          <w:sz w:val="20"/>
+          <w:szCs w:val="20"/>
+          <w:rtl w:val="0"/>
+          <w:lang w:val="en-US"/>
+        </w:rPr>
+        <w:t>DDITIONAL EXPERIENCE</w:t>
       </w:r>
     </w:p>
     <w:p>
@@ -1421,7 +1665,27 @@
           <w:rtl w:val="0"/>
           <w:lang w:val="en-US"/>
         </w:rPr>
-        <w:t>2024–2025</w:t>
+        <w:t>2024</w:t>
+      </w:r>
+      <w:r>
+        <w:rPr>
+          <w:rStyle w:val="None"/>
+          <w:sz w:val="20"/>
+          <w:szCs w:val="20"/>
+          <w:rtl w:val="0"/>
+          <w:lang w:val="en-US"/>
+        </w:rPr>
+        <w:t>–</w:t>
+      </w:r>
+      <w:r>
+        <w:rPr>
+          <w:rStyle w:val="None"/>
+          <w:sz w:val="20"/>
+          <w:szCs w:val="20"/>
+          <w:rtl w:val="0"/>
+          <w:lang w:val="en-US"/>
+        </w:rPr>
+        <w:t>2025</w:t>
         <w:tab/>
         <w:tab/>
       </w:r>
@@ -1648,7 +1912,27 @@
           <w:rtl w:val="0"/>
           <w:lang w:val="en-US"/>
         </w:rPr>
-        <w:t>, 2011–2012</w:t>
+        <w:t>, 2011</w:t>
+      </w:r>
+      <w:r>
+        <w:rPr>
+          <w:rStyle w:val="None"/>
+          <w:sz w:val="20"/>
+          <w:szCs w:val="20"/>
+          <w:rtl w:val="0"/>
+          <w:lang w:val="en-US"/>
+        </w:rPr>
+        <w:t>–</w:t>
+      </w:r>
+      <w:r>
+        <w:rPr>
+          <w:rStyle w:val="None"/>
+          <w:sz w:val="20"/>
+          <w:szCs w:val="20"/>
+          <w:rtl w:val="0"/>
+          <w:lang w:val="en-US"/>
+        </w:rPr>
+        <w:t>2012</w:t>
       </w:r>
     </w:p>
     <w:p>
@@ -1766,7 +2050,27 @@
           <w:rtl w:val="0"/>
           <w:lang w:val="en-US"/>
         </w:rPr>
-        <w:t>2009–2010</w:t>
+        <w:t>2009</w:t>
+      </w:r>
+      <w:r>
+        <w:rPr>
+          <w:rStyle w:val="None"/>
+          <w:sz w:val="20"/>
+          <w:szCs w:val="20"/>
+          <w:rtl w:val="0"/>
+          <w:lang w:val="en-US"/>
+        </w:rPr>
+        <w:t>–</w:t>
+      </w:r>
+      <w:r>
+        <w:rPr>
+          <w:rStyle w:val="None"/>
+          <w:sz w:val="20"/>
+          <w:szCs w:val="20"/>
+          <w:rtl w:val="0"/>
+          <w:lang w:val="en-US"/>
+        </w:rPr>
+        <w:t>2010</w:t>
       </w:r>
     </w:p>
     <w:p>
@@ -1930,7 +2234,27 @@
           <w:rtl w:val="0"/>
           <w:lang w:val="en-US"/>
         </w:rPr>
-        <w:t>, 2008–2009</w:t>
+        <w:t>, 2008</w:t>
+      </w:r>
+      <w:r>
+        <w:rPr>
+          <w:rStyle w:val="None"/>
+          <w:sz w:val="20"/>
+          <w:szCs w:val="20"/>
+          <w:rtl w:val="0"/>
+          <w:lang w:val="en-US"/>
+        </w:rPr>
+        <w:t>–</w:t>
+      </w:r>
+      <w:r>
+        <w:rPr>
+          <w:rStyle w:val="None"/>
+          <w:sz w:val="20"/>
+          <w:szCs w:val="20"/>
+          <w:rtl w:val="0"/>
+          <w:lang w:val="en-US"/>
+        </w:rPr>
+        <w:t>2009</w:t>
       </w:r>
     </w:p>
     <w:p>
@@ -2543,28 +2867,6 @@
         </w14:textFill>
       </w:rPr>
       <w:fldChar w:fldCharType="end" w:fldLock="0"/>
-    </w:r>
-    <w:r>
-      <w:rPr>
-        <w:i w:val="1"/>
-        <w:iCs w:val="1"/>
-        <w:caps w:val="0"/>
-        <w:smallCaps w:val="0"/>
-        <w:strike w:val="0"/>
-        <w:dstrike w:val="0"/>
-        <w:outline w:val="0"/>
-        <w:color w:val="000000"/>
-        <w:sz w:val="20"/>
-        <w:szCs w:val="20"/>
-        <w:u w:val="none" w:color="000000"/>
-        <w:shd w:val="nil" w:color="auto" w:fill="auto"/>
-        <w:vertAlign w:val="baseline"/>
-        <w14:textFill>
-          <w14:solidFill>
-            <w14:srgbClr w14:val="000000"/>
-          </w14:solidFill>
-        </w14:textFill>
-      </w:rPr>
     </w:r>
   </w:p>
 </w:hdr>

</xml_diff>